<commit_message>
Fix bugs LOIS and create folder sem5
</commit_message>
<xml_diff>
--- a/sem4/LOIS/lab1/LOIS_lab1.docx
+++ b/sem4/LOIS/lab1/LOIS_lab1.docx
@@ -546,27 +546,7 @@
           <w:szCs w:val="28"/>
           <w:lang w:eastAsia="ru-RU"/>
         </w:rPr>
-        <w:t xml:space="preserve">Выполнил: </w:t>
-      </w:r>
-      <w:r>
-        <w:rPr>
-          <w:rFonts w:eastAsia="Times New Roman" w:cs="Times New Roman" w:ascii="Times New Roman" w:hAnsi="Times New Roman"/>
-          <w:color w:val="000000"/>
-          <w:sz w:val="28"/>
-          <w:szCs w:val="28"/>
-          <w:lang w:eastAsia="ru-RU"/>
-        </w:rPr>
-        <w:t>Перерва Павло Дмитриевич</w:t>
-      </w:r>
-      <w:r>
-        <w:rPr>
-          <w:rFonts w:eastAsia="Times New Roman" w:cs="Times New Roman" w:ascii="Times New Roman" w:hAnsi="Times New Roman"/>
-          <w:color w:val="000000"/>
-          <w:sz w:val="28"/>
-          <w:szCs w:val="28"/>
-          <w:lang w:eastAsia="ru-RU"/>
-        </w:rPr>
-        <w:t>, 421702</w:t>
+        <w:t>Выполнил: Перерва Павло Дмитриевич, 421702</w:t>
       </w:r>
     </w:p>
     <w:p>
@@ -976,18 +956,7 @@
           <w:szCs w:val="28"/>
           <w:lang w:val="ru-BY" w:eastAsia="ru-RU"/>
         </w:rPr>
-        <w:t>Проверить, является ли формула СКНФ (Совершенной конъюнктивной нормальной формой</w:t>
-      </w:r>
-      <w:r>
-        <w:rPr>
-          <w:rFonts w:eastAsia="Times New Roman" w:cs="Times New Roman" w:ascii="Times New Roman" w:hAnsi="Times New Roman"/>
-          <w:bCs/>
-          <w:color w:val="000000"/>
-          <w:sz w:val="28"/>
-          <w:szCs w:val="28"/>
-          <w:lang w:val="ru-BY" w:eastAsia="ru-RU"/>
-        </w:rPr>
-        <w:t>).</w:t>
+        <w:t>Проверить, является ли формула СКНФ (Совершенной конъюнктивной нормальной формой).</w:t>
       </w:r>
     </w:p>
     <w:p>
@@ -1798,7 +1767,7 @@
           <w:color w:val="000000"/>
           <w:sz w:val="28"/>
           <w:szCs w:val="28"/>
-          <w:lang w:val="ru-BY" w:eastAsia="ru-RU"/>
+          <w:lang w:eastAsia="ru-RU"/>
         </w:rPr>
       </w:r>
     </w:p>
@@ -3135,64 +3104,28 @@
           <w:sz w:val="28"/>
           <w:szCs w:val="28"/>
         </w:rPr>
-        <w:t xml:space="preserve">Таблица </w:t>
+        <w:t>Таблица 4 – о</w:t>
       </w:r>
       <w:r>
         <w:rPr>
           <w:rFonts w:ascii="Times New Roman" w:hAnsi="Times New Roman"/>
           <w:sz w:val="28"/>
           <w:szCs w:val="28"/>
-        </w:rPr>
-        <w:t>4</w:t>
-      </w:r>
-      <w:r>
-        <w:rPr>
-          <w:rFonts w:ascii="Times New Roman" w:hAnsi="Times New Roman"/>
-          <w:sz w:val="28"/>
-          <w:szCs w:val="28"/>
-        </w:rPr>
-        <w:t xml:space="preserve"> – о</w:t>
-      </w:r>
-      <w:r>
-        <w:rPr>
-          <w:rFonts w:ascii="Times New Roman" w:hAnsi="Times New Roman"/>
-          <w:sz w:val="28"/>
-          <w:szCs w:val="28"/>
           <w:lang w:val="en-US"/>
         </w:rPr>
-        <w:t xml:space="preserve">писание </w:t>
-      </w:r>
-      <w:r>
-        <w:rPr>
-          <w:rFonts w:ascii="Times New Roman" w:hAnsi="Times New Roman"/>
-          <w:sz w:val="28"/>
-          <w:szCs w:val="28"/>
+        <w:t>писание функций модуля utils.py</w:t>
+      </w:r>
+    </w:p>
+    <w:p>
+      <w:pPr>
+        <w:pStyle w:val="Standard"/>
+        <w:rPr>
           <w:lang w:val="en-US"/>
         </w:rPr>
-        <w:t>ф</w:t>
-      </w:r>
-      <w:r>
-        <w:rPr>
-          <w:rFonts w:ascii="Times New Roman" w:hAnsi="Times New Roman"/>
-          <w:sz w:val="28"/>
-          <w:szCs w:val="28"/>
+      </w:pPr>
+      <w:r>
+        <w:rPr>
           <w:lang w:val="en-US"/>
-        </w:rPr>
-        <w:t>ункций модуля utils.py</w:t>
-      </w:r>
-    </w:p>
-    <w:p>
-      <w:pPr>
-        <w:pStyle w:val="Standard"/>
-        <w:rPr>
-          <w:lang w:val="en-US"/>
-        </w:rPr>
-      </w:pPr>
-      <w:r>
-        <w:rPr>
-          <w:rFonts w:ascii="Times New Roman" w:hAnsi="Times New Roman"/>
-          <w:sz w:val="28"/>
-          <w:szCs w:val="28"/>
         </w:rPr>
       </w:r>
     </w:p>
@@ -3213,7 +3146,7 @@
       </w:tblPr>
       <w:tblGrid>
         <w:gridCol w:w="3919"/>
-        <w:gridCol w:w="5426"/>
+        <w:gridCol w:w="5425"/>
       </w:tblGrid>
       <w:tr>
         <w:trPr/>
@@ -3252,7 +3185,7 @@
         </w:tc>
         <w:tc>
           <w:tcPr>
-            <w:tcW w:w="5426" w:type="dxa"/>
+            <w:tcW w:w="5425" w:type="dxa"/>
             <w:tcBorders/>
           </w:tcPr>
           <w:p>
@@ -3319,7 +3252,7 @@
         </w:tc>
         <w:tc>
           <w:tcPr>
-            <w:tcW w:w="5426" w:type="dxa"/>
+            <w:tcW w:w="5425" w:type="dxa"/>
             <w:tcBorders/>
           </w:tcPr>
           <w:p>
@@ -3385,57 +3318,19 @@
           <w:szCs w:val="28"/>
           <w:lang w:val="en-US"/>
         </w:rPr>
-        <w:t xml:space="preserve">Таблица </w:t>
-      </w:r>
-      <w:r>
-        <w:rPr>
-          <w:rFonts w:ascii="Times New Roman" w:hAnsi="Times New Roman"/>
-          <w:sz w:val="28"/>
-          <w:szCs w:val="28"/>
+        <w:t>Таблица 5 – описание функций модуля main.py</w:t>
+      </w:r>
+    </w:p>
+    <w:p>
+      <w:pPr>
+        <w:pStyle w:val="Normal"/>
+        <w:rPr>
           <w:lang w:val="en-US"/>
         </w:rPr>
-        <w:t>5</w:t>
-      </w:r>
-      <w:r>
-        <w:rPr>
-          <w:rFonts w:ascii="Times New Roman" w:hAnsi="Times New Roman"/>
-          <w:sz w:val="28"/>
-          <w:szCs w:val="28"/>
+      </w:pPr>
+      <w:r>
+        <w:rPr>
           <w:lang w:val="en-US"/>
-        </w:rPr>
-        <w:t xml:space="preserve"> – описание функций модуля </w:t>
-      </w:r>
-      <w:r>
-        <w:rPr>
-          <w:rFonts w:ascii="Times New Roman" w:hAnsi="Times New Roman"/>
-          <w:sz w:val="28"/>
-          <w:szCs w:val="28"/>
-          <w:lang w:val="en-US"/>
-        </w:rPr>
-        <w:t>main</w:t>
-      </w:r>
-      <w:r>
-        <w:rPr>
-          <w:rFonts w:ascii="Times New Roman" w:hAnsi="Times New Roman"/>
-          <w:sz w:val="28"/>
-          <w:szCs w:val="28"/>
-          <w:lang w:val="en-US"/>
-        </w:rPr>
-        <w:t>.py</w:t>
-      </w:r>
-    </w:p>
-    <w:p>
-      <w:pPr>
-        <w:pStyle w:val="Normal"/>
-        <w:rPr>
-          <w:lang w:val="en-US"/>
-        </w:rPr>
-      </w:pPr>
-      <w:r>
-        <w:rPr>
-          <w:rFonts w:ascii="Times New Roman" w:hAnsi="Times New Roman"/>
-          <w:sz w:val="28"/>
-          <w:szCs w:val="28"/>
         </w:rPr>
       </w:r>
     </w:p>
@@ -3456,7 +3351,7 @@
       </w:tblPr>
       <w:tblGrid>
         <w:gridCol w:w="3919"/>
-        <w:gridCol w:w="5426"/>
+        <w:gridCol w:w="5425"/>
       </w:tblGrid>
       <w:tr>
         <w:trPr/>
@@ -3495,7 +3390,7 @@
         </w:tc>
         <w:tc>
           <w:tcPr>
-            <w:tcW w:w="5426" w:type="dxa"/>
+            <w:tcW w:w="5425" w:type="dxa"/>
             <w:tcBorders/>
           </w:tcPr>
           <w:p>
@@ -3562,7 +3457,7 @@
         </w:tc>
         <w:tc>
           <w:tcPr>
-            <w:tcW w:w="5426" w:type="dxa"/>
+            <w:tcW w:w="5425" w:type="dxa"/>
             <w:tcBorders/>
           </w:tcPr>
           <w:p>
@@ -3629,7 +3524,7 @@
         </w:tc>
         <w:tc>
           <w:tcPr>
-            <w:tcW w:w="5426" w:type="dxa"/>
+            <w:tcW w:w="5425" w:type="dxa"/>
             <w:tcBorders/>
           </w:tcPr>
           <w:p>
@@ -3692,7 +3587,7 @@
         </w:tc>
         <w:tc>
           <w:tcPr>
-            <w:tcW w:w="5426" w:type="dxa"/>
+            <w:tcW w:w="5425" w:type="dxa"/>
             <w:tcBorders/>
           </w:tcPr>
           <w:p>
@@ -3734,7 +3629,14 @@
         </w:rPr>
       </w:pPr>
       <w:r>
-        <w:rPr/>
+        <w:rPr>
+          <w:rFonts w:cs="Times New Roman" w:ascii="Times New Roman" w:hAnsi="Times New Roman"/>
+          <w:b/>
+          <w:bCs/>
+          <w:sz w:val="28"/>
+          <w:szCs w:val="28"/>
+          <w:lang w:val="ru-BY"/>
+        </w:rPr>
       </w:r>
     </w:p>
     <w:p>
@@ -3815,7 +3717,11 @@
         </w:rPr>
       </w:pPr>
       <w:r>
-        <w:rPr/>
+        <w:rPr>
+          <w:rFonts w:cs="Times New Roman" w:ascii="Times New Roman" w:hAnsi="Times New Roman"/>
+          <w:sz w:val="28"/>
+          <w:szCs w:val="28"/>
+        </w:rPr>
       </w:r>
     </w:p>
     <w:p>
@@ -3958,7 +3864,11 @@
         </w:rPr>
       </w:pPr>
       <w:r>
-        <w:rPr/>
+        <w:rPr>
+          <w:rFonts w:cs="Times New Roman" w:ascii="Times New Roman" w:hAnsi="Times New Roman"/>
+          <w:sz w:val="28"/>
+          <w:szCs w:val="28"/>
+        </w:rPr>
       </w:r>
     </w:p>
     <w:p>
@@ -3978,6 +3888,7 @@
           <w:rFonts w:cs="Times New Roman" w:ascii="Times New Roman" w:hAnsi="Times New Roman"/>
           <w:sz w:val="28"/>
           <w:szCs w:val="28"/>
+          <w:lang w:val="en-US"/>
         </w:rPr>
         <w:drawing>
           <wp:anchor behindDoc="0" distT="0" distB="0" distL="0" distR="0" simplePos="0" locked="0" layoutInCell="0" allowOverlap="1" relativeHeight="3">
@@ -4102,7 +4013,12 @@
         </w:rPr>
       </w:pPr>
       <w:r>
-        <w:rPr/>
+        <w:rPr>
+          <w:rFonts w:cs="Times New Roman" w:ascii="Times New Roman" w:hAnsi="Times New Roman"/>
+          <w:sz w:val="28"/>
+          <w:szCs w:val="28"/>
+          <w:lang w:val="en-US"/>
+        </w:rPr>
       </w:r>
     </w:p>
     <w:p>
@@ -4116,7 +4032,12 @@
         </w:rPr>
       </w:pPr>
       <w:r>
-        <w:rPr/>
+        <w:rPr>
+          <w:rFonts w:cs="Times New Roman" w:ascii="Times New Roman" w:hAnsi="Times New Roman"/>
+          <w:sz w:val="28"/>
+          <w:szCs w:val="28"/>
+          <w:lang w:val="en-US"/>
+        </w:rPr>
         <w:drawing>
           <wp:anchor behindDoc="0" distT="0" distB="0" distL="0" distR="0" simplePos="0" locked="0" layoutInCell="0" allowOverlap="1" relativeHeight="4">
             <wp:simplePos x="0" y="0"/>
@@ -4181,23 +4102,7 @@
           <w:sz w:val="28"/>
           <w:szCs w:val="28"/>
         </w:rPr>
-        <w:t xml:space="preserve">Рисунок 3 – </w:t>
-      </w:r>
-      <w:r>
-        <w:rPr>
-          <w:rFonts w:cs="Times New Roman" w:ascii="Times New Roman" w:hAnsi="Times New Roman"/>
-          <w:sz w:val="28"/>
-          <w:szCs w:val="28"/>
-        </w:rPr>
-        <w:t>о</w:t>
-      </w:r>
-      <w:r>
-        <w:rPr>
-          <w:rFonts w:cs="Times New Roman" w:ascii="Times New Roman" w:hAnsi="Times New Roman"/>
-          <w:sz w:val="28"/>
-          <w:szCs w:val="28"/>
-        </w:rPr>
-        <w:t>шибка валидации: недопустимый символ</w:t>
+        <w:t>Рисунок 3 – ошибка валидации: недопустимый символ</w:t>
       </w:r>
     </w:p>
     <w:p>
@@ -4258,7 +4163,12 @@
         </w:rPr>
       </w:pPr>
       <w:r>
-        <w:rPr/>
+        <w:rPr>
+          <w:rFonts w:cs="Times New Roman" w:ascii="Times New Roman" w:hAnsi="Times New Roman"/>
+          <w:sz w:val="28"/>
+          <w:szCs w:val="28"/>
+          <w:lang w:val="en-US"/>
+        </w:rPr>
       </w:r>
     </w:p>
     <w:p>
@@ -4277,7 +4187,12 @@
         </w:rPr>
       </w:pPr>
       <w:r>
-        <w:rPr/>
+        <w:rPr>
+          <w:rFonts w:cs="Times New Roman" w:ascii="Times New Roman" w:hAnsi="Times New Roman"/>
+          <w:sz w:val="28"/>
+          <w:szCs w:val="28"/>
+          <w:lang w:val="en-US"/>
+        </w:rPr>
         <w:drawing>
           <wp:anchor behindDoc="0" distT="0" distB="0" distL="0" distR="0" simplePos="0" locked="0" layoutInCell="0" allowOverlap="1" relativeHeight="5">
             <wp:simplePos x="0" y="0"/>
@@ -4341,37 +4256,25 @@
           <w:sz w:val="28"/>
           <w:szCs w:val="28"/>
         </w:rPr>
-        <w:t xml:space="preserve">Рисунок </w:t>
-      </w:r>
+        <w:t>Рисунок 4 – ошибка валидации: неправильная скобочная последовательность</w:t>
+      </w:r>
+    </w:p>
+    <w:p>
+      <w:pPr>
+        <w:pStyle w:val="Standard"/>
+        <w:jc w:val="center"/>
+        <w:rPr>
+          <w:rFonts w:ascii="Times New Roman" w:hAnsi="Times New Roman" w:cs="Times New Roman"/>
+          <w:sz w:val="28"/>
+          <w:szCs w:val="28"/>
+        </w:rPr>
+      </w:pPr>
       <w:r>
         <w:rPr>
           <w:rFonts w:cs="Times New Roman" w:ascii="Times New Roman" w:hAnsi="Times New Roman"/>
           <w:sz w:val="28"/>
           <w:szCs w:val="28"/>
         </w:rPr>
-        <w:t>4</w:t>
-      </w:r>
-      <w:r>
-        <w:rPr>
-          <w:rFonts w:cs="Times New Roman" w:ascii="Times New Roman" w:hAnsi="Times New Roman"/>
-          <w:sz w:val="28"/>
-          <w:szCs w:val="28"/>
-        </w:rPr>
-        <w:t xml:space="preserve"> – ошибка валидации: неправильная скобочная последовательность</w:t>
-      </w:r>
-    </w:p>
-    <w:p>
-      <w:pPr>
-        <w:pStyle w:val="Standard"/>
-        <w:jc w:val="center"/>
-        <w:rPr>
-          <w:rFonts w:ascii="Times New Roman" w:hAnsi="Times New Roman" w:cs="Times New Roman"/>
-          <w:sz w:val="28"/>
-          <w:szCs w:val="28"/>
-        </w:rPr>
-      </w:pPr>
-      <w:r>
-        <w:rPr/>
       </w:r>
     </w:p>
     <w:p>
@@ -4411,7 +4314,11 @@
         </w:rPr>
       </w:pPr>
       <w:r>
-        <w:rPr/>
+        <w:rPr>
+          <w:rFonts w:cs="Times New Roman" w:ascii="Times New Roman" w:hAnsi="Times New Roman"/>
+          <w:sz w:val="28"/>
+          <w:szCs w:val="28"/>
+        </w:rPr>
       </w:r>
     </w:p>
     <w:p>
@@ -4427,7 +4334,12 @@
         </w:rPr>
       </w:pPr>
       <w:r>
-        <w:rPr/>
+        <w:rPr>
+          <w:rFonts w:cs="Times New Roman" w:ascii="Times New Roman" w:hAnsi="Times New Roman"/>
+          <w:sz w:val="28"/>
+          <w:szCs w:val="28"/>
+          <w:lang w:val="en-US"/>
+        </w:rPr>
         <w:drawing>
           <wp:anchor behindDoc="0" distT="0" distB="0" distL="0" distR="0" simplePos="0" locked="0" layoutInCell="0" allowOverlap="1" relativeHeight="6">
             <wp:simplePos x="0" y="0"/>
@@ -4492,31 +4404,7 @@
           <w:sz w:val="28"/>
           <w:szCs w:val="28"/>
         </w:rPr>
-        <w:t xml:space="preserve">Рисунок </w:t>
-      </w:r>
-      <w:r>
-        <w:rPr>
-          <w:rFonts w:cs="Times New Roman" w:ascii="Times New Roman" w:hAnsi="Times New Roman"/>
-          <w:sz w:val="28"/>
-          <w:szCs w:val="28"/>
-        </w:rPr>
-        <w:t>5</w:t>
-      </w:r>
-      <w:r>
-        <w:rPr>
-          <w:rFonts w:cs="Times New Roman" w:ascii="Times New Roman" w:hAnsi="Times New Roman"/>
-          <w:sz w:val="28"/>
-          <w:szCs w:val="28"/>
-        </w:rPr>
-        <w:t xml:space="preserve"> – ошибка валидации при </w:t>
-      </w:r>
-      <w:r>
-        <w:rPr>
-          <w:rFonts w:cs="Times New Roman" w:ascii="Times New Roman" w:hAnsi="Times New Roman"/>
-          <w:sz w:val="28"/>
-          <w:szCs w:val="28"/>
-        </w:rPr>
-        <w:t>недостающих скобках</w:t>
+        <w:t>Рисунок 5 – ошибка валидации при недостающих скобках</w:t>
       </w:r>
     </w:p>
     <w:p>
@@ -4531,7 +4419,11 @@
         </w:rPr>
       </w:pPr>
       <w:r>
-        <w:rPr/>
+        <w:rPr>
+          <w:rFonts w:cs="Times New Roman" w:ascii="Times New Roman" w:hAnsi="Times New Roman"/>
+          <w:sz w:val="28"/>
+          <w:szCs w:val="28"/>
+        </w:rPr>
       </w:r>
     </w:p>
     <w:p>
@@ -4641,7 +4533,11 @@
         </w:rPr>
       </w:pPr>
       <w:r>
-        <w:rPr/>
+        <w:rPr>
+          <w:rFonts w:cs="Times New Roman" w:ascii="Times New Roman" w:hAnsi="Times New Roman"/>
+          <w:sz w:val="28"/>
+          <w:szCs w:val="28"/>
+        </w:rPr>
         <w:drawing>
           <wp:anchor behindDoc="0" distT="0" distB="0" distL="0" distR="0" simplePos="0" locked="0" layoutInCell="0" allowOverlap="1" relativeHeight="7">
             <wp:simplePos x="0" y="0"/>
@@ -4725,37 +4621,25 @@
           <w:sz w:val="28"/>
           <w:szCs w:val="28"/>
         </w:rPr>
-        <w:t xml:space="preserve">Рисунок </w:t>
-      </w:r>
+        <w:t>Рисунок 6 – пример задания для проверки знаний пользователя</w:t>
+      </w:r>
+    </w:p>
+    <w:p>
+      <w:pPr>
+        <w:pStyle w:val="Standard"/>
+        <w:jc w:val="center"/>
+        <w:rPr>
+          <w:rFonts w:ascii="Times New Roman" w:hAnsi="Times New Roman" w:cs="Times New Roman"/>
+          <w:sz w:val="28"/>
+          <w:szCs w:val="28"/>
+        </w:rPr>
+      </w:pPr>
       <w:r>
         <w:rPr>
           <w:rFonts w:cs="Times New Roman" w:ascii="Times New Roman" w:hAnsi="Times New Roman"/>
           <w:sz w:val="28"/>
           <w:szCs w:val="28"/>
         </w:rPr>
-        <w:t>6</w:t>
-      </w:r>
-      <w:r>
-        <w:rPr>
-          <w:rFonts w:cs="Times New Roman" w:ascii="Times New Roman" w:hAnsi="Times New Roman"/>
-          <w:sz w:val="28"/>
-          <w:szCs w:val="28"/>
-        </w:rPr>
-        <w:t xml:space="preserve"> – пример задания для проверки знаний пользователя</w:t>
-      </w:r>
-    </w:p>
-    <w:p>
-      <w:pPr>
-        <w:pStyle w:val="Standard"/>
-        <w:jc w:val="center"/>
-        <w:rPr>
-          <w:rFonts w:ascii="Times New Roman" w:hAnsi="Times New Roman" w:cs="Times New Roman"/>
-          <w:sz w:val="28"/>
-          <w:szCs w:val="28"/>
-        </w:rPr>
-      </w:pPr>
-      <w:r>
-        <w:rPr/>
       </w:r>
     </w:p>
     <w:p>
@@ -4855,55 +4739,43 @@
           <w:sz w:val="28"/>
           <w:szCs w:val="28"/>
         </w:rPr>
-        <w:t xml:space="preserve">Рисунок </w:t>
-      </w:r>
+        <w:t>Рисунок 7 – ответ для примера при верном выполнении задания</w:t>
+      </w:r>
+    </w:p>
+    <w:p>
+      <w:pPr>
+        <w:pStyle w:val="Standard"/>
+        <w:jc w:val="center"/>
+        <w:rPr>
+          <w:rFonts w:ascii="Times New Roman" w:hAnsi="Times New Roman" w:cs="Times New Roman"/>
+          <w:sz w:val="28"/>
+          <w:szCs w:val="28"/>
+        </w:rPr>
+      </w:pPr>
       <w:r>
         <w:rPr>
           <w:rFonts w:cs="Times New Roman" w:ascii="Times New Roman" w:hAnsi="Times New Roman"/>
           <w:sz w:val="28"/>
           <w:szCs w:val="28"/>
         </w:rPr>
-        <w:t>7</w:t>
-      </w:r>
+      </w:r>
+    </w:p>
+    <w:p>
+      <w:pPr>
+        <w:pStyle w:val="Standard"/>
+        <w:jc w:val="center"/>
+        <w:rPr>
+          <w:rFonts w:ascii="Times New Roman" w:hAnsi="Times New Roman" w:cs="Times New Roman"/>
+          <w:sz w:val="28"/>
+          <w:szCs w:val="28"/>
+        </w:rPr>
+      </w:pPr>
       <w:r>
         <w:rPr>
           <w:rFonts w:cs="Times New Roman" w:ascii="Times New Roman" w:hAnsi="Times New Roman"/>
           <w:sz w:val="28"/>
           <w:szCs w:val="28"/>
         </w:rPr>
-        <w:t xml:space="preserve"> – ответ для примера при верном выполнении задания</w:t>
-      </w:r>
-    </w:p>
-    <w:p>
-      <w:pPr>
-        <w:pStyle w:val="Standard"/>
-        <w:jc w:val="center"/>
-        <w:rPr>
-          <w:rFonts w:ascii="Times New Roman" w:hAnsi="Times New Roman" w:cs="Times New Roman"/>
-          <w:sz w:val="28"/>
-          <w:szCs w:val="28"/>
-        </w:rPr>
-      </w:pPr>
-      <w:r>
-        <w:rPr>
-          <w:rFonts w:cs="Times New Roman" w:ascii="Times New Roman" w:hAnsi="Times New Roman"/>
-          <w:sz w:val="28"/>
-          <w:szCs w:val="28"/>
-        </w:rPr>
-      </w:r>
-    </w:p>
-    <w:p>
-      <w:pPr>
-        <w:pStyle w:val="Standard"/>
-        <w:jc w:val="center"/>
-        <w:rPr>
-          <w:rFonts w:ascii="Times New Roman" w:hAnsi="Times New Roman" w:cs="Times New Roman"/>
-          <w:sz w:val="28"/>
-          <w:szCs w:val="28"/>
-        </w:rPr>
-      </w:pPr>
-      <w:r>
-        <w:rPr/>
         <w:drawing>
           <wp:anchor behindDoc="0" distT="0" distB="0" distL="0" distR="0" simplePos="0" locked="0" layoutInCell="0" allowOverlap="1" relativeHeight="9">
             <wp:simplePos x="0" y="0"/>
@@ -4980,7 +4852,11 @@
         </w:rPr>
       </w:pPr>
       <w:r>
-        <w:rPr/>
+        <w:rPr>
+          <w:rFonts w:cs="Times New Roman" w:ascii="Times New Roman" w:hAnsi="Times New Roman"/>
+          <w:sz w:val="28"/>
+          <w:szCs w:val="28"/>
+        </w:rPr>
       </w:r>
     </w:p>
     <w:p>
@@ -4999,55 +4875,43 @@
           <w:sz w:val="28"/>
           <w:szCs w:val="28"/>
         </w:rPr>
-        <w:t xml:space="preserve">Рисунок </w:t>
-      </w:r>
+        <w:t>Рисунок 8 – пример задания для проверки знания пользователя</w:t>
+      </w:r>
+    </w:p>
+    <w:p>
+      <w:pPr>
+        <w:pStyle w:val="Standard"/>
+        <w:jc w:val="center"/>
+        <w:rPr>
+          <w:rFonts w:ascii="Times New Roman" w:hAnsi="Times New Roman" w:cs="Times New Roman"/>
+          <w:sz w:val="28"/>
+          <w:szCs w:val="28"/>
+        </w:rPr>
+      </w:pPr>
       <w:r>
         <w:rPr>
           <w:rFonts w:cs="Times New Roman" w:ascii="Times New Roman" w:hAnsi="Times New Roman"/>
           <w:sz w:val="28"/>
           <w:szCs w:val="28"/>
         </w:rPr>
-        <w:t>8</w:t>
-      </w:r>
+      </w:r>
+    </w:p>
+    <w:p>
+      <w:pPr>
+        <w:pStyle w:val="Standard"/>
+        <w:jc w:val="center"/>
+        <w:rPr>
+          <w:rFonts w:ascii="Times New Roman" w:hAnsi="Times New Roman" w:cs="Times New Roman"/>
+          <w:sz w:val="28"/>
+          <w:szCs w:val="28"/>
+        </w:rPr>
+      </w:pPr>
       <w:r>
         <w:rPr>
           <w:rFonts w:cs="Times New Roman" w:ascii="Times New Roman" w:hAnsi="Times New Roman"/>
           <w:sz w:val="28"/>
           <w:szCs w:val="28"/>
         </w:rPr>
-        <w:t xml:space="preserve"> – пример задания для проверки знания пользователя</w:t>
-      </w:r>
-    </w:p>
-    <w:p>
-      <w:pPr>
-        <w:pStyle w:val="Standard"/>
-        <w:jc w:val="center"/>
-        <w:rPr>
-          <w:rFonts w:ascii="Times New Roman" w:hAnsi="Times New Roman" w:cs="Times New Roman"/>
-          <w:sz w:val="28"/>
-          <w:szCs w:val="28"/>
-        </w:rPr>
-      </w:pPr>
-      <w:r>
-        <w:rPr>
-          <w:rFonts w:cs="Times New Roman" w:ascii="Times New Roman" w:hAnsi="Times New Roman"/>
-          <w:sz w:val="28"/>
-          <w:szCs w:val="28"/>
-        </w:rPr>
-      </w:r>
-    </w:p>
-    <w:p>
-      <w:pPr>
-        <w:pStyle w:val="Standard"/>
-        <w:jc w:val="center"/>
-        <w:rPr>
-          <w:rFonts w:ascii="Times New Roman" w:hAnsi="Times New Roman" w:cs="Times New Roman"/>
-          <w:sz w:val="28"/>
-          <w:szCs w:val="28"/>
-        </w:rPr>
-      </w:pPr>
-      <w:r>
-        <w:rPr/>
         <w:drawing>
           <wp:anchor behindDoc="0" distT="0" distB="0" distL="0" distR="0" simplePos="0" locked="0" layoutInCell="0" allowOverlap="1" relativeHeight="10">
             <wp:simplePos x="0" y="0"/>
@@ -5129,23 +4993,7 @@
           <w:sz w:val="28"/>
           <w:szCs w:val="28"/>
         </w:rPr>
-        <w:t xml:space="preserve">Рисунок </w:t>
-      </w:r>
-      <w:r>
-        <w:rPr>
-          <w:rFonts w:cs="Times New Roman" w:ascii="Times New Roman" w:hAnsi="Times New Roman"/>
-          <w:sz w:val="28"/>
-          <w:szCs w:val="28"/>
-        </w:rPr>
-        <w:t>9</w:t>
-      </w:r>
-      <w:r>
-        <w:rPr>
-          <w:rFonts w:cs="Times New Roman" w:ascii="Times New Roman" w:hAnsi="Times New Roman"/>
-          <w:sz w:val="28"/>
-          <w:szCs w:val="28"/>
-        </w:rPr>
-        <w:t xml:space="preserve"> – ответ для примера при неверном выполнении задания</w:t>
+        <w:t>Рисунок 9 – ответ для примера при неверном выполнении задания</w:t>
       </w:r>
     </w:p>
     <w:p>
@@ -5653,8 +5501,20 @@
           <w:szCs w:val="28"/>
           <w:lang w:val="ru-BY"/>
         </w:rPr>
-        <w:t>[2] The Python Tutorial [Электронный ресурс] : Python 3.12.3 documentation. – Режим доступа: https://docs.python.org/3/tutorial/index.html. – Дата доступа: 0</w:t>
-      </w:r>
+        <w:t>[2] The Python Tutorial [Электронный ресурс] : Python 3.12.3 documentation. – Режим доступа: https://docs.python.org/3/tutorial/index.html. – Дата доступа: 01.06.2026.</w:t>
+      </w:r>
+    </w:p>
+    <w:p>
+      <w:pPr>
+        <w:pStyle w:val="Standard"/>
+        <w:jc w:val="both"/>
+        <w:rPr>
+          <w:rFonts w:ascii="Times New Roman" w:hAnsi="Times New Roman" w:cs="Times New Roman"/>
+          <w:sz w:val="28"/>
+          <w:szCs w:val="28"/>
+          <w:lang w:val="ru-BY"/>
+        </w:rPr>
+      </w:pPr>
       <w:r>
         <w:rPr>
           <w:rFonts w:cs="Times New Roman" w:ascii="Times New Roman" w:hAnsi="Times New Roman"/>
@@ -5662,16 +5522,27 @@
           <w:szCs w:val="28"/>
           <w:lang w:val="ru-BY"/>
         </w:rPr>
-        <w:t>1</w:t>
-      </w:r>
+      </w:r>
+    </w:p>
+    <w:p>
+      <w:pPr>
+        <w:pStyle w:val="Standard"/>
+        <w:jc w:val="both"/>
+        <w:rPr>
+          <w:rFonts w:ascii="Times New Roman" w:hAnsi="Times New Roman" w:cs="Times New Roman"/>
+          <w:sz w:val="28"/>
+          <w:szCs w:val="28"/>
+          <w:lang w:val="ru-BY"/>
+        </w:rPr>
+      </w:pPr>
       <w:r>
         <w:rPr>
           <w:rFonts w:cs="Times New Roman" w:ascii="Times New Roman" w:hAnsi="Times New Roman"/>
           <w:sz w:val="28"/>
           <w:szCs w:val="28"/>
-          <w:lang w:val="ru-BY"/>
-        </w:rPr>
-        <w:t>.06.2026.</w:t>
+          <w:lang w:val="be-BY"/>
+        </w:rPr>
+        <w:t>[3] Python Tutorial [Электронный ресурс] : W3Schools : платформа для обучения веб-технологиям. – Режим доступа: https://www.w3schools.com/python/. – Дата доступа: 01.06.2026.</w:t>
       </w:r>
     </w:p>
     <w:p>
@@ -5712,148 +5583,68 @@
           <w:szCs w:val="28"/>
           <w:lang w:val="be-BY"/>
         </w:rPr>
-        <w:t>[3] Python Tutorial [Электронный ресурс] : W3Schools : платформа для обучения веб-технологиям. – Режим доступа: https://www.w3schools.com/python/. – Дата доступа: 0</w:t>
-      </w:r>
+        <w:t>[4] Pytest: helps you write better programs [Электронный ресурс] : Pytest documentation : официальная документация фреймворка. – Режим доступа: https://docs.pytest.org/en/stable/. – Дата доступа: 01.06.2026.</w:t>
+      </w:r>
+    </w:p>
+    <w:p>
+      <w:pPr>
+        <w:pStyle w:val="Standard"/>
+        <w:jc w:val="both"/>
+        <w:rPr>
+          <w:rFonts w:ascii="Times New Roman" w:hAnsi="Times New Roman" w:cs="Times New Roman"/>
+          <w:sz w:val="28"/>
+          <w:szCs w:val="28"/>
+          <w:lang w:val="ru-BY"/>
+        </w:rPr>
+      </w:pPr>
       <w:r>
         <w:rPr>
           <w:rFonts w:cs="Times New Roman" w:ascii="Times New Roman" w:hAnsi="Times New Roman"/>
           <w:sz w:val="28"/>
           <w:szCs w:val="28"/>
+          <w:lang w:val="ru-BY"/>
+        </w:rPr>
+      </w:r>
+    </w:p>
+    <w:p>
+      <w:pPr>
+        <w:pStyle w:val="Standard"/>
+        <w:jc w:val="both"/>
+        <w:rPr>
+          <w:rFonts w:ascii="Times New Roman" w:hAnsi="Times New Roman" w:cs="Times New Roman"/>
+          <w:sz w:val="28"/>
+          <w:szCs w:val="28"/>
+          <w:lang w:val="ru-BY"/>
+        </w:rPr>
+      </w:pPr>
+      <w:r>
+        <w:rPr>
+          <w:rFonts w:cs="Times New Roman" w:ascii="Times New Roman" w:hAnsi="Times New Roman"/>
+          <w:sz w:val="28"/>
+          <w:szCs w:val="28"/>
           <w:lang w:val="be-BY"/>
         </w:rPr>
-        <w:t>1</w:t>
-      </w:r>
+        <w:t>[5] PEP 8 – Style Guide for Python Code [Электронный ресурс] : Python Enhancement Proposals. – Режим доступа: https://peps.python.org/pep-0008/. – Дата доступа: 01.06.2026.</w:t>
+      </w:r>
+    </w:p>
+    <w:p>
+      <w:pPr>
+        <w:pStyle w:val="Standard"/>
+        <w:jc w:val="both"/>
+        <w:rPr>
+          <w:rFonts w:ascii="Times New Roman" w:hAnsi="Times New Roman" w:cs="Times New Roman"/>
+          <w:sz w:val="28"/>
+          <w:szCs w:val="28"/>
+          <w:lang w:val="ru-BY"/>
+        </w:rPr>
+      </w:pPr>
       <w:r>
         <w:rPr>
           <w:rFonts w:cs="Times New Roman" w:ascii="Times New Roman" w:hAnsi="Times New Roman"/>
           <w:sz w:val="28"/>
           <w:szCs w:val="28"/>
-          <w:lang w:val="be-BY"/>
-        </w:rPr>
-        <w:t>.06.2026.</w:t>
-      </w:r>
-    </w:p>
-    <w:p>
-      <w:pPr>
-        <w:pStyle w:val="Standard"/>
-        <w:jc w:val="both"/>
-        <w:rPr>
-          <w:rFonts w:ascii="Times New Roman" w:hAnsi="Times New Roman" w:cs="Times New Roman"/>
-          <w:sz w:val="28"/>
-          <w:szCs w:val="28"/>
-          <w:lang w:val="ru-BY"/>
-        </w:rPr>
-      </w:pPr>
-      <w:r>
-        <w:rPr/>
-      </w:r>
-    </w:p>
-    <w:p>
-      <w:pPr>
-        <w:pStyle w:val="Standard"/>
-        <w:jc w:val="both"/>
-        <w:rPr>
-          <w:rFonts w:ascii="Times New Roman" w:hAnsi="Times New Roman" w:cs="Times New Roman"/>
-          <w:sz w:val="28"/>
-          <w:szCs w:val="28"/>
-          <w:lang w:val="ru-BY"/>
-        </w:rPr>
-      </w:pPr>
-      <w:r>
-        <w:rPr>
-          <w:rFonts w:cs="Times New Roman" w:ascii="Times New Roman" w:hAnsi="Times New Roman"/>
-          <w:sz w:val="28"/>
-          <w:szCs w:val="28"/>
-          <w:lang w:val="be-BY"/>
-        </w:rPr>
-        <w:t>[4] Pytest: helps you write better programs [Электронный ресурс] : Pytest documentation : официальная документация фреймворка. – Режим доступа: https://docs.pytest.org/en/stable/. – Дата доступа: 0</w:t>
-      </w:r>
-      <w:r>
-        <w:rPr>
-          <w:rFonts w:cs="Times New Roman" w:ascii="Times New Roman" w:hAnsi="Times New Roman"/>
-          <w:sz w:val="28"/>
-          <w:szCs w:val="28"/>
-          <w:lang w:val="be-BY"/>
-        </w:rPr>
-        <w:t>1</w:t>
-      </w:r>
-      <w:r>
-        <w:rPr>
-          <w:rFonts w:cs="Times New Roman" w:ascii="Times New Roman" w:hAnsi="Times New Roman"/>
-          <w:sz w:val="28"/>
-          <w:szCs w:val="28"/>
-          <w:lang w:val="be-BY"/>
-        </w:rPr>
-        <w:t>.06.2026.</w:t>
-      </w:r>
-    </w:p>
-    <w:p>
-      <w:pPr>
-        <w:pStyle w:val="Standard"/>
-        <w:jc w:val="both"/>
-        <w:rPr>
-          <w:rFonts w:ascii="Times New Roman" w:hAnsi="Times New Roman" w:cs="Times New Roman"/>
-          <w:sz w:val="28"/>
-          <w:szCs w:val="28"/>
-          <w:lang w:val="ru-BY"/>
-        </w:rPr>
-      </w:pPr>
-      <w:r>
-        <w:rPr/>
-      </w:r>
-    </w:p>
-    <w:p>
-      <w:pPr>
-        <w:pStyle w:val="Standard"/>
-        <w:jc w:val="both"/>
-        <w:rPr>
-          <w:rFonts w:ascii="Times New Roman" w:hAnsi="Times New Roman" w:cs="Times New Roman"/>
-          <w:sz w:val="28"/>
-          <w:szCs w:val="28"/>
-          <w:lang w:val="ru-BY"/>
-        </w:rPr>
-      </w:pPr>
-      <w:r>
-        <w:rPr>
-          <w:rFonts w:cs="Times New Roman" w:ascii="Times New Roman" w:hAnsi="Times New Roman"/>
-          <w:sz w:val="28"/>
-          <w:szCs w:val="28"/>
-          <w:lang w:val="be-BY"/>
-        </w:rPr>
-        <w:t>[5] PEP 8 – Style Guide for Python Code [Электронный ресурс] : Python Enhancement Proposals. – Режим доступа: https://peps.python.org/pep-0008/. – Дата доступа: 0</w:t>
-      </w:r>
-      <w:r>
-        <w:rPr>
-          <w:rFonts w:cs="Times New Roman" w:ascii="Times New Roman" w:hAnsi="Times New Roman"/>
-          <w:sz w:val="28"/>
-          <w:szCs w:val="28"/>
-          <w:lang w:val="be-BY"/>
-        </w:rPr>
-        <w:t>1</w:t>
-      </w:r>
-      <w:r>
-        <w:rPr>
-          <w:rFonts w:cs="Times New Roman" w:ascii="Times New Roman" w:hAnsi="Times New Roman"/>
-          <w:sz w:val="28"/>
-          <w:szCs w:val="28"/>
-          <w:lang w:val="be-BY"/>
-        </w:rPr>
-        <w:t>.06.2026.</w:t>
-      </w:r>
-    </w:p>
-    <w:p>
-      <w:pPr>
-        <w:pStyle w:val="Standard"/>
-        <w:jc w:val="both"/>
-        <w:rPr>
-          <w:rFonts w:ascii="Times New Roman" w:hAnsi="Times New Roman" w:cs="Times New Roman"/>
-          <w:sz w:val="28"/>
-          <w:szCs w:val="28"/>
-          <w:lang w:val="ru-BY"/>
-        </w:rPr>
-      </w:pPr>
-      <w:r>
-        <w:rPr/>
+          <w:lang w:val="ru-BY"/>
+        </w:rPr>
       </w:r>
     </w:p>
     <w:p>
@@ -6239,25 +6030,7 @@
           <w:szCs w:val="24"/>
           <w:lang w:val="ru-BY"/>
         </w:rPr>
-        <w:t># Дата: 0</w:t>
-      </w:r>
-      <w:r>
-        <w:rPr>
-          <w:rFonts w:cs="Courier New" w:ascii="Courier New" w:hAnsi="Courier New"/>
-          <w:sz w:val="24"/>
-          <w:szCs w:val="24"/>
-          <w:lang w:val="ru-BY"/>
-        </w:rPr>
-        <w:t>1</w:t>
-      </w:r>
-      <w:r>
-        <w:rPr>
-          <w:rFonts w:cs="Courier New" w:ascii="Courier New" w:hAnsi="Courier New"/>
-          <w:sz w:val="24"/>
-          <w:szCs w:val="24"/>
-          <w:lang w:val="ru-BY"/>
-        </w:rPr>
-        <w:t>.06.2026</w:t>
+        <w:t># Дата: 01.06.2026</w:t>
       </w:r>
     </w:p>
     <w:p>
@@ -6377,7 +6150,12 @@
         </w:rPr>
       </w:pPr>
       <w:r>
-        <w:rPr/>
+        <w:rPr>
+          <w:rFonts w:cs="Courier New" w:ascii="Courier New" w:hAnsi="Courier New"/>
+          <w:sz w:val="24"/>
+          <w:szCs w:val="24"/>
+          <w:lang w:val="ru-RU"/>
+        </w:rPr>
       </w:r>
     </w:p>
     <w:p>
@@ -6473,7 +6251,12 @@
         </w:rPr>
       </w:pPr>
       <w:r>
-        <w:rPr/>
+        <w:rPr>
+          <w:rFonts w:cs="Courier New" w:ascii="Courier New" w:hAnsi="Courier New"/>
+          <w:sz w:val="24"/>
+          <w:szCs w:val="24"/>
+          <w:lang w:val="ru-RU"/>
+        </w:rPr>
       </w:r>
     </w:p>
     <w:p>
@@ -6659,37 +6442,52 @@
         </w:rPr>
       </w:pPr>
       <w:r>
-        <w:rPr/>
-      </w:r>
-    </w:p>
-    <w:p>
-      <w:pPr>
-        <w:pStyle w:val="Normal"/>
-        <w:spacing w:before="0" w:after="0"/>
-        <w:rPr>
-          <w:rFonts w:ascii="Courier New" w:hAnsi="Courier New" w:cs="Courier New"/>
-          <w:sz w:val="24"/>
-          <w:szCs w:val="24"/>
-          <w:lang w:val="ru-RU"/>
-        </w:rPr>
-      </w:pPr>
-      <w:r>
-        <w:rPr/>
-      </w:r>
-    </w:p>
-    <w:p>
-      <w:pPr>
-        <w:pStyle w:val="Normal"/>
-        <w:spacing w:before="0" w:after="0"/>
-        <w:rPr>
-          <w:rFonts w:ascii="Courier New" w:hAnsi="Courier New" w:cs="Courier New"/>
-          <w:sz w:val="24"/>
-          <w:szCs w:val="24"/>
-          <w:lang w:val="ru-RU"/>
-        </w:rPr>
-      </w:pPr>
-      <w:r>
-        <w:rPr/>
+        <w:rPr>
+          <w:rFonts w:cs="Courier New" w:ascii="Courier New" w:hAnsi="Courier New"/>
+          <w:sz w:val="24"/>
+          <w:szCs w:val="24"/>
+          <w:lang w:val="ru-RU"/>
+        </w:rPr>
+      </w:r>
+    </w:p>
+    <w:p>
+      <w:pPr>
+        <w:pStyle w:val="Normal"/>
+        <w:spacing w:before="0" w:after="0"/>
+        <w:rPr>
+          <w:rFonts w:ascii="Courier New" w:hAnsi="Courier New" w:cs="Courier New"/>
+          <w:sz w:val="24"/>
+          <w:szCs w:val="24"/>
+          <w:lang w:val="ru-RU"/>
+        </w:rPr>
+      </w:pPr>
+      <w:r>
+        <w:rPr>
+          <w:rFonts w:cs="Courier New" w:ascii="Courier New" w:hAnsi="Courier New"/>
+          <w:sz w:val="24"/>
+          <w:szCs w:val="24"/>
+          <w:lang w:val="ru-RU"/>
+        </w:rPr>
+      </w:r>
+    </w:p>
+    <w:p>
+      <w:pPr>
+        <w:pStyle w:val="Normal"/>
+        <w:spacing w:before="0" w:after="0"/>
+        <w:rPr>
+          <w:rFonts w:ascii="Courier New" w:hAnsi="Courier New" w:cs="Courier New"/>
+          <w:sz w:val="24"/>
+          <w:szCs w:val="24"/>
+          <w:lang w:val="ru-RU"/>
+        </w:rPr>
+      </w:pPr>
+      <w:r>
+        <w:rPr>
+          <w:rFonts w:cs="Courier New" w:ascii="Courier New" w:hAnsi="Courier New"/>
+          <w:sz w:val="24"/>
+          <w:szCs w:val="24"/>
+          <w:lang w:val="ru-RU"/>
+        </w:rPr>
       </w:r>
     </w:p>
     <w:p>
@@ -6935,7 +6733,12 @@
         </w:rPr>
       </w:pPr>
       <w:r>
-        <w:rPr/>
+        <w:rPr>
+          <w:rFonts w:cs="Courier New" w:ascii="Courier New" w:hAnsi="Courier New"/>
+          <w:sz w:val="24"/>
+          <w:szCs w:val="24"/>
+          <w:lang w:val="ru-RU"/>
+        </w:rPr>
       </w:r>
     </w:p>
     <w:p>
@@ -6971,7 +6774,12 @@
         </w:rPr>
       </w:pPr>
       <w:r>
-        <w:rPr/>
+        <w:rPr>
+          <w:rFonts w:cs="Courier New" w:ascii="Courier New" w:hAnsi="Courier New"/>
+          <w:sz w:val="24"/>
+          <w:szCs w:val="24"/>
+          <w:lang w:val="ru-RU"/>
+        </w:rPr>
       </w:r>
     </w:p>
     <w:p>
@@ -7187,7 +6995,12 @@
         </w:rPr>
       </w:pPr>
       <w:r>
-        <w:rPr/>
+        <w:rPr>
+          <w:rFonts w:cs="Courier New" w:ascii="Courier New" w:hAnsi="Courier New"/>
+          <w:sz w:val="24"/>
+          <w:szCs w:val="24"/>
+          <w:lang w:val="ru-RU"/>
+        </w:rPr>
       </w:r>
     </w:p>
     <w:p>
@@ -7523,7 +7336,12 @@
         </w:rPr>
       </w:pPr>
       <w:r>
-        <w:rPr/>
+        <w:rPr>
+          <w:rFonts w:cs="Courier New" w:ascii="Courier New" w:hAnsi="Courier New"/>
+          <w:sz w:val="24"/>
+          <w:szCs w:val="24"/>
+          <w:lang w:val="ru-RU"/>
+        </w:rPr>
       </w:r>
     </w:p>
     <w:p>
@@ -7598,7 +7416,12 @@
         </w:rPr>
       </w:pPr>
       <w:r>
-        <w:rPr/>
+        <w:rPr>
+          <w:rFonts w:cs="Courier New" w:ascii="Courier New" w:hAnsi="Courier New"/>
+          <w:sz w:val="24"/>
+          <w:szCs w:val="24"/>
+          <w:lang w:val="ru-RU"/>
+        </w:rPr>
       </w:r>
     </w:p>
     <w:p>
@@ -7703,7 +7526,12 @@
         </w:rPr>
       </w:pPr>
       <w:r>
-        <w:rPr/>
+        <w:rPr>
+          <w:rFonts w:cs="Courier New" w:ascii="Courier New" w:hAnsi="Courier New"/>
+          <w:sz w:val="24"/>
+          <w:szCs w:val="24"/>
+          <w:lang w:val="ru-RU"/>
+        </w:rPr>
       </w:r>
     </w:p>
     <w:p>
@@ -7778,7 +7606,12 @@
         </w:rPr>
       </w:pPr>
       <w:r>
-        <w:rPr/>
+        <w:rPr>
+          <w:rFonts w:cs="Courier New" w:ascii="Courier New" w:hAnsi="Courier New"/>
+          <w:sz w:val="24"/>
+          <w:szCs w:val="24"/>
+          <w:lang w:val="ru-RU"/>
+        </w:rPr>
       </w:r>
     </w:p>
     <w:p>
@@ -7913,7 +7746,12 @@
         </w:rPr>
       </w:pPr>
       <w:r>
-        <w:rPr/>
+        <w:rPr>
+          <w:rFonts w:cs="Courier New" w:ascii="Courier New" w:hAnsi="Courier New"/>
+          <w:sz w:val="24"/>
+          <w:szCs w:val="24"/>
+          <w:lang w:val="ru-RU"/>
+        </w:rPr>
       </w:r>
     </w:p>
     <w:p>
@@ -8048,7 +7886,12 @@
         </w:rPr>
       </w:pPr>
       <w:r>
-        <w:rPr/>
+        <w:rPr>
+          <w:rFonts w:cs="Courier New" w:ascii="Courier New" w:hAnsi="Courier New"/>
+          <w:sz w:val="24"/>
+          <w:szCs w:val="24"/>
+          <w:lang w:val="ru-RU"/>
+        </w:rPr>
       </w:r>
     </w:p>
     <w:p>
@@ -8183,7 +8026,12 @@
         </w:rPr>
       </w:pPr>
       <w:r>
-        <w:rPr/>
+        <w:rPr>
+          <w:rFonts w:cs="Courier New" w:ascii="Courier New" w:hAnsi="Courier New"/>
+          <w:sz w:val="24"/>
+          <w:szCs w:val="24"/>
+          <w:lang w:val="ru-RU"/>
+        </w:rPr>
       </w:r>
     </w:p>
     <w:p>
@@ -8258,7 +8106,12 @@
         </w:rPr>
       </w:pPr>
       <w:r>
-        <w:rPr/>
+        <w:rPr>
+          <w:rFonts w:cs="Courier New" w:ascii="Courier New" w:hAnsi="Courier New"/>
+          <w:sz w:val="24"/>
+          <w:szCs w:val="24"/>
+          <w:lang w:val="ru-RU"/>
+        </w:rPr>
       </w:r>
     </w:p>
     <w:p>
@@ -8333,7 +8186,12 @@
         </w:rPr>
       </w:pPr>
       <w:r>
-        <w:rPr/>
+        <w:rPr>
+          <w:rFonts w:cs="Courier New" w:ascii="Courier New" w:hAnsi="Courier New"/>
+          <w:sz w:val="24"/>
+          <w:szCs w:val="24"/>
+          <w:lang w:val="ru-RU"/>
+        </w:rPr>
       </w:r>
     </w:p>
     <w:p>
@@ -8378,37 +8236,52 @@
         </w:rPr>
       </w:pPr>
       <w:r>
-        <w:rPr/>
-      </w:r>
-    </w:p>
-    <w:p>
-      <w:pPr>
-        <w:pStyle w:val="Normal"/>
-        <w:spacing w:before="0" w:after="0"/>
-        <w:rPr>
-          <w:rFonts w:ascii="Courier New" w:hAnsi="Courier New" w:cs="Courier New"/>
-          <w:sz w:val="24"/>
-          <w:szCs w:val="24"/>
-          <w:lang w:val="ru-RU"/>
-        </w:rPr>
-      </w:pPr>
-      <w:r>
-        <w:rPr/>
-      </w:r>
-    </w:p>
-    <w:p>
-      <w:pPr>
-        <w:pStyle w:val="Normal"/>
-        <w:spacing w:before="0" w:after="0"/>
-        <w:rPr>
-          <w:rFonts w:ascii="Courier New" w:hAnsi="Courier New" w:cs="Courier New"/>
-          <w:sz w:val="24"/>
-          <w:szCs w:val="24"/>
-          <w:lang w:val="ru-RU"/>
-        </w:rPr>
-      </w:pPr>
-      <w:r>
-        <w:rPr/>
+        <w:rPr>
+          <w:rFonts w:cs="Courier New" w:ascii="Courier New" w:hAnsi="Courier New"/>
+          <w:sz w:val="24"/>
+          <w:szCs w:val="24"/>
+          <w:lang w:val="ru-RU"/>
+        </w:rPr>
+      </w:r>
+    </w:p>
+    <w:p>
+      <w:pPr>
+        <w:pStyle w:val="Normal"/>
+        <w:spacing w:before="0" w:after="0"/>
+        <w:rPr>
+          <w:rFonts w:ascii="Courier New" w:hAnsi="Courier New" w:cs="Courier New"/>
+          <w:sz w:val="24"/>
+          <w:szCs w:val="24"/>
+          <w:lang w:val="ru-RU"/>
+        </w:rPr>
+      </w:pPr>
+      <w:r>
+        <w:rPr>
+          <w:rFonts w:cs="Courier New" w:ascii="Courier New" w:hAnsi="Courier New"/>
+          <w:sz w:val="24"/>
+          <w:szCs w:val="24"/>
+          <w:lang w:val="ru-RU"/>
+        </w:rPr>
+      </w:r>
+    </w:p>
+    <w:p>
+      <w:pPr>
+        <w:pStyle w:val="Normal"/>
+        <w:spacing w:before="0" w:after="0"/>
+        <w:rPr>
+          <w:rFonts w:ascii="Courier New" w:hAnsi="Courier New" w:cs="Courier New"/>
+          <w:sz w:val="24"/>
+          <w:szCs w:val="24"/>
+          <w:lang w:val="ru-RU"/>
+        </w:rPr>
+      </w:pPr>
+      <w:r>
+        <w:rPr>
+          <w:rFonts w:cs="Courier New" w:ascii="Courier New" w:hAnsi="Courier New"/>
+          <w:sz w:val="24"/>
+          <w:szCs w:val="24"/>
+          <w:lang w:val="ru-RU"/>
+        </w:rPr>
       </w:r>
     </w:p>
     <w:p>
@@ -8654,7 +8527,12 @@
         </w:rPr>
       </w:pPr>
       <w:r>
-        <w:rPr/>
+        <w:rPr>
+          <w:rFonts w:cs="Courier New" w:ascii="Courier New" w:hAnsi="Courier New"/>
+          <w:sz w:val="24"/>
+          <w:szCs w:val="24"/>
+          <w:lang w:val="ru-RU"/>
+        </w:rPr>
       </w:r>
     </w:p>
     <w:p>
@@ -8690,7 +8568,12 @@
         </w:rPr>
       </w:pPr>
       <w:r>
-        <w:rPr/>
+        <w:rPr>
+          <w:rFonts w:cs="Courier New" w:ascii="Courier New" w:hAnsi="Courier New"/>
+          <w:sz w:val="24"/>
+          <w:szCs w:val="24"/>
+          <w:lang w:val="ru-RU"/>
+        </w:rPr>
       </w:r>
     </w:p>
     <w:p>
@@ -8966,7 +8849,12 @@
         </w:rPr>
       </w:pPr>
       <w:r>
-        <w:rPr/>
+        <w:rPr>
+          <w:rFonts w:cs="Courier New" w:ascii="Courier New" w:hAnsi="Courier New"/>
+          <w:sz w:val="24"/>
+          <w:szCs w:val="24"/>
+          <w:lang w:val="ru-RU"/>
+        </w:rPr>
       </w:r>
     </w:p>
     <w:p>
@@ -9191,22 +9079,32 @@
         </w:rPr>
       </w:pPr>
       <w:r>
-        <w:rPr/>
-      </w:r>
-    </w:p>
-    <w:p>
-      <w:pPr>
-        <w:pStyle w:val="Normal"/>
-        <w:spacing w:before="0" w:after="0"/>
-        <w:rPr>
-          <w:rFonts w:ascii="Courier New" w:hAnsi="Courier New" w:cs="Courier New"/>
-          <w:sz w:val="24"/>
-          <w:szCs w:val="24"/>
-          <w:lang w:val="ru-RU"/>
-        </w:rPr>
-      </w:pPr>
-      <w:r>
-        <w:rPr/>
+        <w:rPr>
+          <w:rFonts w:cs="Courier New" w:ascii="Courier New" w:hAnsi="Courier New"/>
+          <w:sz w:val="24"/>
+          <w:szCs w:val="24"/>
+          <w:lang w:val="ru-RU"/>
+        </w:rPr>
+      </w:r>
+    </w:p>
+    <w:p>
+      <w:pPr>
+        <w:pStyle w:val="Normal"/>
+        <w:spacing w:before="0" w:after="0"/>
+        <w:rPr>
+          <w:rFonts w:ascii="Courier New" w:hAnsi="Courier New" w:cs="Courier New"/>
+          <w:sz w:val="24"/>
+          <w:szCs w:val="24"/>
+          <w:lang w:val="ru-RU"/>
+        </w:rPr>
+      </w:pPr>
+      <w:r>
+        <w:rPr>
+          <w:rFonts w:cs="Courier New" w:ascii="Courier New" w:hAnsi="Courier New"/>
+          <w:sz w:val="24"/>
+          <w:szCs w:val="24"/>
+          <w:lang w:val="ru-RU"/>
+        </w:rPr>
       </w:r>
     </w:p>
     <w:p>
@@ -9452,7 +9350,12 @@
         </w:rPr>
       </w:pPr>
       <w:r>
-        <w:rPr/>
+        <w:rPr>
+          <w:rFonts w:cs="Courier New" w:ascii="Courier New" w:hAnsi="Courier New"/>
+          <w:sz w:val="24"/>
+          <w:szCs w:val="24"/>
+          <w:lang w:val="ru-RU"/>
+        </w:rPr>
       </w:r>
     </w:p>
     <w:p>
@@ -9497,7 +9400,12 @@
         </w:rPr>
       </w:pPr>
       <w:r>
-        <w:rPr/>
+        <w:rPr>
+          <w:rFonts w:cs="Courier New" w:ascii="Courier New" w:hAnsi="Courier New"/>
+          <w:sz w:val="24"/>
+          <w:szCs w:val="24"/>
+          <w:lang w:val="ru-RU"/>
+        </w:rPr>
       </w:r>
     </w:p>
     <w:p>
@@ -9572,7 +9480,12 @@
         </w:rPr>
       </w:pPr>
       <w:r>
-        <w:rPr/>
+        <w:rPr>
+          <w:rFonts w:cs="Courier New" w:ascii="Courier New" w:hAnsi="Courier New"/>
+          <w:sz w:val="24"/>
+          <w:szCs w:val="24"/>
+          <w:lang w:val="ru-RU"/>
+        </w:rPr>
       </w:r>
     </w:p>
     <w:p>
@@ -9647,7 +9560,12 @@
         </w:rPr>
       </w:pPr>
       <w:r>
-        <w:rPr/>
+        <w:rPr>
+          <w:rFonts w:cs="Courier New" w:ascii="Courier New" w:hAnsi="Courier New"/>
+          <w:sz w:val="24"/>
+          <w:szCs w:val="24"/>
+          <w:lang w:val="ru-RU"/>
+        </w:rPr>
       </w:r>
     </w:p>
     <w:p>
@@ -9782,7 +9700,12 @@
         </w:rPr>
       </w:pPr>
       <w:r>
-        <w:rPr/>
+        <w:rPr>
+          <w:rFonts w:cs="Courier New" w:ascii="Courier New" w:hAnsi="Courier New"/>
+          <w:sz w:val="24"/>
+          <w:szCs w:val="24"/>
+          <w:lang w:val="ru-RU"/>
+        </w:rPr>
       </w:r>
     </w:p>
     <w:p>
@@ -10019,7 +9942,12 @@
         </w:rPr>
       </w:pPr>
       <w:r>
-        <w:rPr/>
+        <w:rPr>
+          <w:rFonts w:cs="Courier New" w:ascii="Courier New" w:hAnsi="Courier New"/>
+          <w:sz w:val="24"/>
+          <w:szCs w:val="24"/>
+          <w:lang w:val="ru-RU"/>
+        </w:rPr>
       </w:r>
     </w:p>
     <w:p>
@@ -10064,7 +9992,12 @@
         </w:rPr>
       </w:pPr>
       <w:r>
-        <w:rPr/>
+        <w:rPr>
+          <w:rFonts w:cs="Courier New" w:ascii="Courier New" w:hAnsi="Courier New"/>
+          <w:sz w:val="24"/>
+          <w:szCs w:val="24"/>
+          <w:lang w:val="ru-RU"/>
+        </w:rPr>
       </w:r>
     </w:p>
     <w:p>
@@ -10220,7 +10153,12 @@
         </w:rPr>
       </w:pPr>
       <w:r>
-        <w:rPr/>
+        <w:rPr>
+          <w:rFonts w:cs="Courier New" w:ascii="Courier New" w:hAnsi="Courier New"/>
+          <w:sz w:val="24"/>
+          <w:szCs w:val="24"/>
+          <w:lang w:val="ru-RU"/>
+        </w:rPr>
       </w:r>
     </w:p>
     <w:p>
@@ -10265,7 +10203,12 @@
         </w:rPr>
       </w:pPr>
       <w:r>
-        <w:rPr/>
+        <w:rPr>
+          <w:rFonts w:cs="Courier New" w:ascii="Courier New" w:hAnsi="Courier New"/>
+          <w:sz w:val="24"/>
+          <w:szCs w:val="24"/>
+          <w:lang w:val="ru-RU"/>
+        </w:rPr>
       </w:r>
     </w:p>
     <w:p>
@@ -10340,7 +10283,12 @@
         </w:rPr>
       </w:pPr>
       <w:r>
-        <w:rPr/>
+        <w:rPr>
+          <w:rFonts w:cs="Courier New" w:ascii="Courier New" w:hAnsi="Courier New"/>
+          <w:sz w:val="24"/>
+          <w:szCs w:val="24"/>
+          <w:lang w:val="ru-RU"/>
+        </w:rPr>
       </w:r>
     </w:p>
     <w:p>
@@ -10385,7 +10333,12 @@
         </w:rPr>
       </w:pPr>
       <w:r>
-        <w:rPr/>
+        <w:rPr>
+          <w:rFonts w:cs="Courier New" w:ascii="Courier New" w:hAnsi="Courier New"/>
+          <w:sz w:val="24"/>
+          <w:szCs w:val="24"/>
+          <w:lang w:val="ru-RU"/>
+        </w:rPr>
       </w:r>
     </w:p>
     <w:p>
@@ -10430,22 +10383,32 @@
         </w:rPr>
       </w:pPr>
       <w:r>
-        <w:rPr/>
-      </w:r>
-    </w:p>
-    <w:p>
-      <w:pPr>
-        <w:pStyle w:val="Normal"/>
-        <w:spacing w:before="0" w:after="0"/>
-        <w:rPr>
-          <w:rFonts w:ascii="Courier New" w:hAnsi="Courier New" w:cs="Courier New"/>
-          <w:sz w:val="24"/>
-          <w:szCs w:val="24"/>
-          <w:lang w:val="ru-RU"/>
-        </w:rPr>
-      </w:pPr>
-      <w:r>
-        <w:rPr/>
+        <w:rPr>
+          <w:rFonts w:cs="Courier New" w:ascii="Courier New" w:hAnsi="Courier New"/>
+          <w:sz w:val="24"/>
+          <w:szCs w:val="24"/>
+          <w:lang w:val="ru-RU"/>
+        </w:rPr>
+      </w:r>
+    </w:p>
+    <w:p>
+      <w:pPr>
+        <w:pStyle w:val="Normal"/>
+        <w:spacing w:before="0" w:after="0"/>
+        <w:rPr>
+          <w:rFonts w:ascii="Courier New" w:hAnsi="Courier New" w:cs="Courier New"/>
+          <w:sz w:val="24"/>
+          <w:szCs w:val="24"/>
+          <w:lang w:val="ru-RU"/>
+        </w:rPr>
+      </w:pPr>
+      <w:r>
+        <w:rPr>
+          <w:rFonts w:cs="Courier New" w:ascii="Courier New" w:hAnsi="Courier New"/>
+          <w:sz w:val="24"/>
+          <w:szCs w:val="24"/>
+          <w:lang w:val="ru-RU"/>
+        </w:rPr>
       </w:r>
     </w:p>
     <w:p>
@@ -10661,7 +10624,12 @@
         </w:rPr>
       </w:pPr>
       <w:r>
-        <w:rPr/>
+        <w:rPr>
+          <w:rFonts w:cs="Courier New" w:ascii="Courier New" w:hAnsi="Courier New"/>
+          <w:sz w:val="24"/>
+          <w:szCs w:val="24"/>
+          <w:lang w:val="ru-RU"/>
+        </w:rPr>
       </w:r>
     </w:p>
     <w:p>
@@ -10706,7 +10674,12 @@
         </w:rPr>
       </w:pPr>
       <w:r>
-        <w:rPr/>
+        <w:rPr>
+          <w:rFonts w:cs="Courier New" w:ascii="Courier New" w:hAnsi="Courier New"/>
+          <w:sz w:val="24"/>
+          <w:szCs w:val="24"/>
+          <w:lang w:val="ru-RU"/>
+        </w:rPr>
       </w:r>
     </w:p>
     <w:p>
@@ -10781,7 +10754,12 @@
         </w:rPr>
       </w:pPr>
       <w:r>
-        <w:rPr/>
+        <w:rPr>
+          <w:rFonts w:cs="Courier New" w:ascii="Courier New" w:hAnsi="Courier New"/>
+          <w:sz w:val="24"/>
+          <w:szCs w:val="24"/>
+          <w:lang w:val="ru-RU"/>
+        </w:rPr>
       </w:r>
     </w:p>
     <w:p>
@@ -10826,37 +10804,52 @@
         </w:rPr>
       </w:pPr>
       <w:r>
-        <w:rPr/>
-      </w:r>
-    </w:p>
-    <w:p>
-      <w:pPr>
-        <w:pStyle w:val="Normal"/>
-        <w:spacing w:before="0" w:after="0"/>
-        <w:rPr>
-          <w:rFonts w:ascii="Courier New" w:hAnsi="Courier New" w:cs="Courier New"/>
-          <w:sz w:val="24"/>
-          <w:szCs w:val="24"/>
-          <w:lang w:val="ru-RU"/>
-        </w:rPr>
-      </w:pPr>
-      <w:r>
-        <w:rPr/>
-      </w:r>
-    </w:p>
-    <w:p>
-      <w:pPr>
-        <w:pStyle w:val="Normal"/>
-        <w:spacing w:before="0" w:after="0"/>
-        <w:rPr>
-          <w:rFonts w:ascii="Courier New" w:hAnsi="Courier New" w:cs="Courier New"/>
-          <w:sz w:val="24"/>
-          <w:szCs w:val="24"/>
-          <w:lang w:val="ru-RU"/>
-        </w:rPr>
-      </w:pPr>
-      <w:r>
-        <w:rPr/>
+        <w:rPr>
+          <w:rFonts w:cs="Courier New" w:ascii="Courier New" w:hAnsi="Courier New"/>
+          <w:sz w:val="24"/>
+          <w:szCs w:val="24"/>
+          <w:lang w:val="ru-RU"/>
+        </w:rPr>
+      </w:r>
+    </w:p>
+    <w:p>
+      <w:pPr>
+        <w:pStyle w:val="Normal"/>
+        <w:spacing w:before="0" w:after="0"/>
+        <w:rPr>
+          <w:rFonts w:ascii="Courier New" w:hAnsi="Courier New" w:cs="Courier New"/>
+          <w:sz w:val="24"/>
+          <w:szCs w:val="24"/>
+          <w:lang w:val="ru-RU"/>
+        </w:rPr>
+      </w:pPr>
+      <w:r>
+        <w:rPr>
+          <w:rFonts w:cs="Courier New" w:ascii="Courier New" w:hAnsi="Courier New"/>
+          <w:sz w:val="24"/>
+          <w:szCs w:val="24"/>
+          <w:lang w:val="ru-RU"/>
+        </w:rPr>
+      </w:r>
+    </w:p>
+    <w:p>
+      <w:pPr>
+        <w:pStyle w:val="Normal"/>
+        <w:spacing w:before="0" w:after="0"/>
+        <w:rPr>
+          <w:rFonts w:ascii="Courier New" w:hAnsi="Courier New" w:cs="Courier New"/>
+          <w:sz w:val="24"/>
+          <w:szCs w:val="24"/>
+          <w:lang w:val="ru-RU"/>
+        </w:rPr>
+      </w:pPr>
+      <w:r>
+        <w:rPr>
+          <w:rFonts w:cs="Courier New" w:ascii="Courier New" w:hAnsi="Courier New"/>
+          <w:sz w:val="24"/>
+          <w:szCs w:val="24"/>
+          <w:lang w:val="ru-RU"/>
+        </w:rPr>
       </w:r>
     </w:p>
     <w:p>
@@ -10961,25 +10954,7 @@
           <w:szCs w:val="24"/>
           <w:lang w:val="ru-BY"/>
         </w:rPr>
-        <w:t># Дата: 0</w:t>
-      </w:r>
-      <w:r>
-        <w:rPr>
-          <w:rFonts w:cs="Courier New" w:ascii="Courier New" w:hAnsi="Courier New"/>
-          <w:sz w:val="24"/>
-          <w:szCs w:val="24"/>
-          <w:lang w:val="ru-BY"/>
-        </w:rPr>
-        <w:t>1</w:t>
-      </w:r>
-      <w:r>
-        <w:rPr>
-          <w:rFonts w:cs="Courier New" w:ascii="Courier New" w:hAnsi="Courier New"/>
-          <w:sz w:val="24"/>
-          <w:szCs w:val="24"/>
-          <w:lang w:val="ru-BY"/>
-        </w:rPr>
-        <w:t>.06.2026</w:t>
+        <w:t># Дата: 01.06.2026</w:t>
       </w:r>
     </w:p>
     <w:p>
@@ -11120,7 +11095,12 @@
         </w:rPr>
       </w:pPr>
       <w:r>
-        <w:rPr/>
+        <w:rPr>
+          <w:rFonts w:cs="Courier New" w:ascii="Courier New" w:hAnsi="Courier New"/>
+          <w:sz w:val="24"/>
+          <w:szCs w:val="24"/>
+          <w:lang w:val="ru-RU"/>
+        </w:rPr>
       </w:r>
     </w:p>
     <w:p>
@@ -11177,7 +11157,12 @@
         </w:rPr>
       </w:pPr>
       <w:r>
-        <w:rPr/>
+        <w:rPr>
+          <w:rFonts w:cs="Courier New" w:ascii="Courier New" w:hAnsi="Courier New"/>
+          <w:sz w:val="24"/>
+          <w:szCs w:val="24"/>
+          <w:lang w:val="ru-RU"/>
+        </w:rPr>
       </w:r>
     </w:p>
     <w:p>
@@ -11453,7 +11438,12 @@
         </w:rPr>
       </w:pPr>
       <w:r>
-        <w:rPr/>
+        <w:rPr>
+          <w:rFonts w:cs="Courier New" w:ascii="Courier New" w:hAnsi="Courier New"/>
+          <w:sz w:val="24"/>
+          <w:szCs w:val="24"/>
+          <w:lang w:val="ru-RU"/>
+        </w:rPr>
       </w:r>
     </w:p>
     <w:p>
@@ -11699,7 +11689,12 @@
         </w:rPr>
       </w:pPr>
       <w:r>
-        <w:rPr/>
+        <w:rPr>
+          <w:rFonts w:cs="Courier New" w:ascii="Courier New" w:hAnsi="Courier New"/>
+          <w:sz w:val="24"/>
+          <w:szCs w:val="24"/>
+          <w:lang w:val="ru-RU"/>
+        </w:rPr>
       </w:r>
     </w:p>
     <w:p>
@@ -12158,7 +12153,12 @@
         </w:rPr>
       </w:pPr>
       <w:r>
-        <w:rPr/>
+        <w:rPr>
+          <w:rFonts w:cs="Courier New" w:ascii="Courier New" w:hAnsi="Courier New"/>
+          <w:sz w:val="24"/>
+          <w:szCs w:val="24"/>
+          <w:lang w:val="ru-RU"/>
+        </w:rPr>
       </w:r>
     </w:p>
     <w:p>
@@ -12404,7 +12404,12 @@
         </w:rPr>
       </w:pPr>
       <w:r>
-        <w:rPr/>
+        <w:rPr>
+          <w:rFonts w:cs="Courier New" w:ascii="Courier New" w:hAnsi="Courier New"/>
+          <w:sz w:val="24"/>
+          <w:szCs w:val="24"/>
+          <w:lang w:val="ru-RU"/>
+        </w:rPr>
       </w:r>
     </w:p>
     <w:p>
@@ -12500,7 +12505,12 @@
         </w:rPr>
       </w:pPr>
       <w:r>
-        <w:rPr/>
+        <w:rPr>
+          <w:rFonts w:cs="Courier New" w:ascii="Courier New" w:hAnsi="Courier New"/>
+          <w:sz w:val="24"/>
+          <w:szCs w:val="24"/>
+          <w:lang w:val="ru-RU"/>
+        </w:rPr>
       </w:r>
     </w:p>
     <w:p>
@@ -12776,7 +12786,12 @@
         </w:rPr>
       </w:pPr>
       <w:r>
-        <w:rPr/>
+        <w:rPr>
+          <w:rFonts w:cs="Courier New" w:ascii="Courier New" w:hAnsi="Courier New"/>
+          <w:sz w:val="24"/>
+          <w:szCs w:val="24"/>
+          <w:lang w:val="ru-RU"/>
+        </w:rPr>
       </w:r>
     </w:p>
     <w:p>
@@ -12851,7 +12866,12 @@
         </w:rPr>
       </w:pPr>
       <w:r>
-        <w:rPr/>
+        <w:rPr>
+          <w:rFonts w:cs="Courier New" w:ascii="Courier New" w:hAnsi="Courier New"/>
+          <w:sz w:val="24"/>
+          <w:szCs w:val="24"/>
+          <w:lang w:val="ru-RU"/>
+        </w:rPr>
       </w:r>
     </w:p>
     <w:p>
@@ -12896,7 +12916,12 @@
         </w:rPr>
       </w:pPr>
       <w:r>
-        <w:rPr/>
+        <w:rPr>
+          <w:rFonts w:cs="Courier New" w:ascii="Courier New" w:hAnsi="Courier New"/>
+          <w:sz w:val="24"/>
+          <w:szCs w:val="24"/>
+          <w:lang w:val="ru-RU"/>
+        </w:rPr>
       </w:r>
     </w:p>
     <w:p>
@@ -12971,7 +12996,12 @@
         </w:rPr>
       </w:pPr>
       <w:r>
-        <w:rPr/>
+        <w:rPr>
+          <w:rFonts w:cs="Courier New" w:ascii="Courier New" w:hAnsi="Courier New"/>
+          <w:sz w:val="24"/>
+          <w:szCs w:val="24"/>
+          <w:lang w:val="ru-RU"/>
+        </w:rPr>
       </w:r>
     </w:p>
     <w:p>
@@ -13016,37 +13046,52 @@
         </w:rPr>
       </w:pPr>
       <w:r>
-        <w:rPr/>
-      </w:r>
-    </w:p>
-    <w:p>
-      <w:pPr>
-        <w:pStyle w:val="Normal"/>
-        <w:spacing w:before="0" w:after="0"/>
-        <w:rPr>
-          <w:rFonts w:ascii="Courier New" w:hAnsi="Courier New" w:cs="Courier New"/>
-          <w:sz w:val="24"/>
-          <w:szCs w:val="24"/>
-          <w:lang w:val="ru-RU"/>
-        </w:rPr>
-      </w:pPr>
-      <w:r>
-        <w:rPr/>
-      </w:r>
-    </w:p>
-    <w:p>
-      <w:pPr>
-        <w:pStyle w:val="Normal"/>
-        <w:spacing w:before="0" w:after="0"/>
-        <w:rPr>
-          <w:rFonts w:ascii="Courier New" w:hAnsi="Courier New" w:cs="Courier New"/>
-          <w:sz w:val="24"/>
-          <w:szCs w:val="24"/>
-          <w:lang w:val="ru-RU"/>
-        </w:rPr>
-      </w:pPr>
-      <w:r>
-        <w:rPr/>
+        <w:rPr>
+          <w:rFonts w:cs="Courier New" w:ascii="Courier New" w:hAnsi="Courier New"/>
+          <w:sz w:val="24"/>
+          <w:szCs w:val="24"/>
+          <w:lang w:val="ru-RU"/>
+        </w:rPr>
+      </w:r>
+    </w:p>
+    <w:p>
+      <w:pPr>
+        <w:pStyle w:val="Normal"/>
+        <w:spacing w:before="0" w:after="0"/>
+        <w:rPr>
+          <w:rFonts w:ascii="Courier New" w:hAnsi="Courier New" w:cs="Courier New"/>
+          <w:sz w:val="24"/>
+          <w:szCs w:val="24"/>
+          <w:lang w:val="ru-RU"/>
+        </w:rPr>
+      </w:pPr>
+      <w:r>
+        <w:rPr>
+          <w:rFonts w:cs="Courier New" w:ascii="Courier New" w:hAnsi="Courier New"/>
+          <w:sz w:val="24"/>
+          <w:szCs w:val="24"/>
+          <w:lang w:val="ru-RU"/>
+        </w:rPr>
+      </w:r>
+    </w:p>
+    <w:p>
+      <w:pPr>
+        <w:pStyle w:val="Normal"/>
+        <w:spacing w:before="0" w:after="0"/>
+        <w:rPr>
+          <w:rFonts w:ascii="Courier New" w:hAnsi="Courier New" w:cs="Courier New"/>
+          <w:sz w:val="24"/>
+          <w:szCs w:val="24"/>
+          <w:lang w:val="ru-RU"/>
+        </w:rPr>
+      </w:pPr>
+      <w:r>
+        <w:rPr>
+          <w:rFonts w:cs="Courier New" w:ascii="Courier New" w:hAnsi="Courier New"/>
+          <w:sz w:val="24"/>
+          <w:szCs w:val="24"/>
+          <w:lang w:val="ru-RU"/>
+        </w:rPr>
       </w:r>
     </w:p>
     <w:p>
@@ -13151,25 +13196,7 @@
           <w:szCs w:val="24"/>
           <w:lang w:val="ru-BY"/>
         </w:rPr>
-        <w:t># Дата: 0</w:t>
-      </w:r>
-      <w:r>
-        <w:rPr>
-          <w:rFonts w:cs="Courier New" w:ascii="Courier New" w:hAnsi="Courier New"/>
-          <w:sz w:val="24"/>
-          <w:szCs w:val="24"/>
-          <w:lang w:val="ru-BY"/>
-        </w:rPr>
-        <w:t>1</w:t>
-      </w:r>
-      <w:r>
-        <w:rPr>
-          <w:rFonts w:cs="Courier New" w:ascii="Courier New" w:hAnsi="Courier New"/>
-          <w:sz w:val="24"/>
-          <w:szCs w:val="24"/>
-          <w:lang w:val="ru-BY"/>
-        </w:rPr>
-        <w:t>.06.2026</w:t>
+        <w:t># Дата: 01.06.2026</w:t>
       </w:r>
     </w:p>
     <w:p>
@@ -13310,7 +13337,12 @@
         </w:rPr>
       </w:pPr>
       <w:r>
-        <w:rPr/>
+        <w:rPr>
+          <w:rFonts w:cs="Courier New" w:ascii="Courier New" w:hAnsi="Courier New"/>
+          <w:sz w:val="24"/>
+          <w:szCs w:val="24"/>
+          <w:lang w:val="ru-RU"/>
+        </w:rPr>
       </w:r>
     </w:p>
     <w:p>
@@ -13430,7 +13462,12 @@
         </w:rPr>
       </w:pPr>
       <w:r>
-        <w:rPr/>
+        <w:rPr>
+          <w:rFonts w:cs="Courier New" w:ascii="Courier New" w:hAnsi="Courier New"/>
+          <w:sz w:val="24"/>
+          <w:szCs w:val="24"/>
+          <w:lang w:val="ru-RU"/>
+        </w:rPr>
       </w:r>
     </w:p>
     <w:p>
@@ -13949,22 +13986,32 @@
         </w:rPr>
       </w:pPr>
       <w:r>
-        <w:rPr/>
-      </w:r>
-    </w:p>
-    <w:p>
-      <w:pPr>
-        <w:pStyle w:val="Normal"/>
-        <w:spacing w:before="0" w:after="0"/>
-        <w:rPr>
-          <w:rFonts w:ascii="Courier New" w:hAnsi="Courier New" w:cs="Courier New"/>
-          <w:sz w:val="24"/>
-          <w:szCs w:val="24"/>
-          <w:lang w:val="ru-RU"/>
-        </w:rPr>
-      </w:pPr>
-      <w:r>
-        <w:rPr/>
+        <w:rPr>
+          <w:rFonts w:cs="Courier New" w:ascii="Courier New" w:hAnsi="Courier New"/>
+          <w:sz w:val="24"/>
+          <w:szCs w:val="24"/>
+          <w:lang w:val="ru-RU"/>
+        </w:rPr>
+      </w:r>
+    </w:p>
+    <w:p>
+      <w:pPr>
+        <w:pStyle w:val="Normal"/>
+        <w:spacing w:before="0" w:after="0"/>
+        <w:rPr>
+          <w:rFonts w:ascii="Courier New" w:hAnsi="Courier New" w:cs="Courier New"/>
+          <w:sz w:val="24"/>
+          <w:szCs w:val="24"/>
+          <w:lang w:val="ru-RU"/>
+        </w:rPr>
+      </w:pPr>
+      <w:r>
+        <w:rPr>
+          <w:rFonts w:cs="Courier New" w:ascii="Courier New" w:hAnsi="Courier New"/>
+          <w:sz w:val="24"/>
+          <w:szCs w:val="24"/>
+          <w:lang w:val="ru-RU"/>
+        </w:rPr>
       </w:r>
     </w:p>
     <w:p>
@@ -14120,7 +14167,12 @@
         </w:rPr>
       </w:pPr>
       <w:r>
-        <w:rPr/>
+        <w:rPr>
+          <w:rFonts w:cs="Courier New" w:ascii="Courier New" w:hAnsi="Courier New"/>
+          <w:sz w:val="24"/>
+          <w:szCs w:val="24"/>
+          <w:lang w:val="ru-RU"/>
+        </w:rPr>
       </w:r>
     </w:p>
     <w:p>
@@ -14936,7 +14988,12 @@
         </w:rPr>
       </w:pPr>
       <w:r>
-        <w:rPr/>
+        <w:rPr>
+          <w:rFonts w:cs="Courier New" w:ascii="Courier New" w:hAnsi="Courier New"/>
+          <w:sz w:val="24"/>
+          <w:szCs w:val="24"/>
+          <w:lang w:val="ru-RU"/>
+        </w:rPr>
       </w:r>
     </w:p>
     <w:p>
@@ -15011,7 +15068,12 @@
         </w:rPr>
       </w:pPr>
       <w:r>
-        <w:rPr/>
+        <w:rPr>
+          <w:rFonts w:cs="Courier New" w:ascii="Courier New" w:hAnsi="Courier New"/>
+          <w:sz w:val="24"/>
+          <w:szCs w:val="24"/>
+          <w:lang w:val="ru-RU"/>
+        </w:rPr>
       </w:r>
     </w:p>
     <w:p>
@@ -15287,7 +15349,12 @@
         </w:rPr>
       </w:pPr>
       <w:r>
-        <w:rPr/>
+        <w:rPr>
+          <w:rFonts w:cs="Courier New" w:ascii="Courier New" w:hAnsi="Courier New"/>
+          <w:sz w:val="24"/>
+          <w:szCs w:val="24"/>
+          <w:lang w:val="ru-RU"/>
+        </w:rPr>
       </w:r>
     </w:p>
     <w:p>
@@ -15482,7 +15549,12 @@
         </w:rPr>
       </w:pPr>
       <w:r>
-        <w:rPr/>
+        <w:rPr>
+          <w:rFonts w:cs="Courier New" w:ascii="Courier New" w:hAnsi="Courier New"/>
+          <w:sz w:val="24"/>
+          <w:szCs w:val="24"/>
+          <w:lang w:val="ru-RU"/>
+        </w:rPr>
       </w:r>
     </w:p>
     <w:p>
@@ -15647,7 +15719,12 @@
         </w:rPr>
       </w:pPr>
       <w:r>
-        <w:rPr/>
+        <w:rPr>
+          <w:rFonts w:cs="Courier New" w:ascii="Courier New" w:hAnsi="Courier New"/>
+          <w:sz w:val="24"/>
+          <w:szCs w:val="24"/>
+          <w:lang w:val="ru-RU"/>
+        </w:rPr>
       </w:r>
     </w:p>
     <w:p>
@@ -15692,22 +15769,32 @@
         </w:rPr>
       </w:pPr>
       <w:r>
-        <w:rPr/>
-      </w:r>
-    </w:p>
-    <w:p>
-      <w:pPr>
-        <w:pStyle w:val="Normal"/>
-        <w:spacing w:before="0" w:after="0"/>
-        <w:rPr>
-          <w:rFonts w:ascii="Courier New" w:hAnsi="Courier New" w:cs="Courier New"/>
-          <w:sz w:val="24"/>
-          <w:szCs w:val="24"/>
-          <w:lang w:val="ru-RU"/>
-        </w:rPr>
-      </w:pPr>
-      <w:r>
-        <w:rPr/>
+        <w:rPr>
+          <w:rFonts w:cs="Courier New" w:ascii="Courier New" w:hAnsi="Courier New"/>
+          <w:sz w:val="24"/>
+          <w:szCs w:val="24"/>
+          <w:lang w:val="ru-RU"/>
+        </w:rPr>
+      </w:r>
+    </w:p>
+    <w:p>
+      <w:pPr>
+        <w:pStyle w:val="Normal"/>
+        <w:spacing w:before="0" w:after="0"/>
+        <w:rPr>
+          <w:rFonts w:ascii="Courier New" w:hAnsi="Courier New" w:cs="Courier New"/>
+          <w:sz w:val="24"/>
+          <w:szCs w:val="24"/>
+          <w:lang w:val="ru-RU"/>
+        </w:rPr>
+      </w:pPr>
+      <w:r>
+        <w:rPr>
+          <w:rFonts w:cs="Courier New" w:ascii="Courier New" w:hAnsi="Courier New"/>
+          <w:sz w:val="24"/>
+          <w:szCs w:val="24"/>
+          <w:lang w:val="ru-RU"/>
+        </w:rPr>
       </w:r>
     </w:p>
     <w:p>
@@ -16355,7 +16442,12 @@
         </w:rPr>
       </w:pPr>
       <w:r>
-        <w:rPr/>
+        <w:rPr>
+          <w:rFonts w:cs="Courier New" w:ascii="Courier New" w:hAnsi="Courier New"/>
+          <w:sz w:val="24"/>
+          <w:szCs w:val="24"/>
+          <w:lang w:val="ru-RU"/>
+        </w:rPr>
       </w:r>
     </w:p>
     <w:p>
@@ -16531,21 +16623,7 @@
           <w:rFonts w:cs="Times New Roman" w:ascii="Courier New" w:hAnsi="Courier New"/>
           <w:lang w:val="ru-BY"/>
         </w:rPr>
-        <w:t># Дата: 0</w:t>
-      </w:r>
-      <w:r>
-        <w:rPr>
-          <w:rFonts w:cs="Times New Roman" w:ascii="Courier New" w:hAnsi="Courier New"/>
-          <w:lang w:val="ru-BY"/>
-        </w:rPr>
-        <w:t>1</w:t>
-      </w:r>
-      <w:r>
-        <w:rPr>
-          <w:rFonts w:cs="Times New Roman" w:ascii="Courier New" w:hAnsi="Courier New"/>
-          <w:lang w:val="ru-BY"/>
-        </w:rPr>
-        <w:t>.06.2026</w:t>
+        <w:t># Дата: 01.06.2026</w:t>
       </w:r>
     </w:p>
     <w:p>
@@ -17413,21 +17491,7 @@
           <w:rFonts w:cs="Times New Roman" w:ascii="Courier New" w:hAnsi="Courier New"/>
           <w:lang w:val="ru-BY"/>
         </w:rPr>
-        <w:t># Дата: 0</w:t>
-      </w:r>
-      <w:r>
-        <w:rPr>
-          <w:rFonts w:cs="Times New Roman" w:ascii="Courier New" w:hAnsi="Courier New"/>
-          <w:lang w:val="ru-BY"/>
-        </w:rPr>
-        <w:t>1</w:t>
-      </w:r>
-      <w:r>
-        <w:rPr>
-          <w:rFonts w:cs="Times New Roman" w:ascii="Courier New" w:hAnsi="Courier New"/>
-          <w:lang w:val="ru-BY"/>
-        </w:rPr>
-        <w:t>.06.2026</w:t>
+        <w:t># Дата: 01.06.2026</w:t>
       </w:r>
     </w:p>
     <w:p>
@@ -18456,21 +18520,7 @@
           <w:rFonts w:cs="Times New Roman" w:ascii="Courier New" w:hAnsi="Courier New"/>
           <w:lang w:val="ru-BY"/>
         </w:rPr>
-        <w:t># Дата: 0</w:t>
-      </w:r>
-      <w:r>
-        <w:rPr>
-          <w:rFonts w:cs="Times New Roman" w:ascii="Courier New" w:hAnsi="Courier New"/>
-          <w:lang w:val="ru-BY"/>
-        </w:rPr>
-        <w:t>1</w:t>
-      </w:r>
-      <w:r>
-        <w:rPr>
-          <w:rFonts w:cs="Times New Roman" w:ascii="Courier New" w:hAnsi="Courier New"/>
-          <w:lang w:val="ru-BY"/>
-        </w:rPr>
-        <w:t>.06.2026</w:t>
+        <w:t># Дата: 01.06.2026</w:t>
       </w:r>
     </w:p>
     <w:p>
@@ -19742,7 +19792,14 @@
         </w:rPr>
       </w:pPr>
       <w:r>
-        <w:rPr/>
+        <w:rPr>
+          <w:rFonts w:cs="Times New Roman" w:ascii="Times New Roman" w:hAnsi="Times New Roman"/>
+          <w:b/>
+          <w:bCs/>
+          <w:sz w:val="28"/>
+          <w:szCs w:val="28"/>
+          <w:lang w:val="ru-BY"/>
+        </w:rPr>
       </w:r>
     </w:p>
     <w:p>
@@ -19758,7 +19815,14 @@
         </w:rPr>
       </w:pPr>
       <w:r>
-        <w:rPr/>
+        <w:rPr>
+          <w:rFonts w:cs="Times New Roman" w:ascii="Times New Roman" w:hAnsi="Times New Roman"/>
+          <w:b/>
+          <w:bCs/>
+          <w:sz w:val="28"/>
+          <w:szCs w:val="28"/>
+          <w:lang w:val="ru-BY"/>
+        </w:rPr>
         <w:drawing>
           <wp:anchor behindDoc="0" distT="0" distB="0" distL="0" distR="0" simplePos="0" locked="0" layoutInCell="0" allowOverlap="1" relativeHeight="11">
             <wp:simplePos x="0" y="0"/>
@@ -19837,7 +19901,11 @@
         </w:rPr>
       </w:pPr>
       <w:r>
-        <w:rPr/>
+        <w:rPr>
+          <w:rFonts w:cs="Times New Roman" w:ascii="Times New Roman" w:hAnsi="Times New Roman"/>
+          <w:sz w:val="28"/>
+          <w:szCs w:val="28"/>
+        </w:rPr>
       </w:r>
     </w:p>
     <w:p>
@@ -19851,7 +19919,11 @@
         </w:rPr>
       </w:pPr>
       <w:r>
-        <w:rPr/>
+        <w:rPr>
+          <w:rFonts w:cs="Times New Roman" w:ascii="Times New Roman" w:hAnsi="Times New Roman"/>
+          <w:sz w:val="28"/>
+          <w:szCs w:val="28"/>
+        </w:rPr>
       </w:r>
     </w:p>
     <w:p>
@@ -19865,7 +19937,11 @@
         </w:rPr>
       </w:pPr>
       <w:r>
-        <w:rPr/>
+        <w:rPr>
+          <w:rFonts w:cs="Times New Roman" w:ascii="Times New Roman" w:hAnsi="Times New Roman"/>
+          <w:sz w:val="28"/>
+          <w:szCs w:val="28"/>
+        </w:rPr>
       </w:r>
     </w:p>
     <w:p>
@@ -19879,7 +19955,11 @@
         </w:rPr>
       </w:pPr>
       <w:r>
-        <w:rPr/>
+        <w:rPr>
+          <w:rFonts w:cs="Times New Roman" w:ascii="Times New Roman" w:hAnsi="Times New Roman"/>
+          <w:sz w:val="28"/>
+          <w:szCs w:val="28"/>
+        </w:rPr>
       </w:r>
     </w:p>
     <w:p>
@@ -19893,7 +19973,11 @@
         </w:rPr>
       </w:pPr>
       <w:r>
-        <w:rPr/>
+        <w:rPr>
+          <w:rFonts w:cs="Times New Roman" w:ascii="Times New Roman" w:hAnsi="Times New Roman"/>
+          <w:sz w:val="28"/>
+          <w:szCs w:val="28"/>
+        </w:rPr>
       </w:r>
     </w:p>
     <w:p>
@@ -19907,7 +19991,11 @@
         </w:rPr>
       </w:pPr>
       <w:r>
-        <w:rPr/>
+        <w:rPr>
+          <w:rFonts w:cs="Times New Roman" w:ascii="Times New Roman" w:hAnsi="Times New Roman"/>
+          <w:sz w:val="28"/>
+          <w:szCs w:val="28"/>
+        </w:rPr>
       </w:r>
     </w:p>
     <w:p>
@@ -19921,7 +20009,11 @@
         </w:rPr>
       </w:pPr>
       <w:r>
-        <w:rPr/>
+        <w:rPr>
+          <w:rFonts w:cs="Times New Roman" w:ascii="Times New Roman" w:hAnsi="Times New Roman"/>
+          <w:sz w:val="28"/>
+          <w:szCs w:val="28"/>
+        </w:rPr>
       </w:r>
     </w:p>
     <w:p>
@@ -20022,27 +20114,11 @@
         <w:rPr>
           <w:lang w:val="ru-BY"/>
         </w:rPr>
-        <w:t xml:space="preserve">Рисунок </w:t>
-      </w:r>
-      <w:r>
-        <w:rPr>
-          <w:lang w:val="ru-BY"/>
-        </w:rPr>
-        <w:t>2</w:t>
-      </w:r>
-      <w:r>
-        <w:rPr>
-          <w:lang w:val="ru-BY"/>
-        </w:rPr>
-        <w:t xml:space="preserve"> – </w:t>
+        <w:t xml:space="preserve">Рисунок 2 – </w:t>
       </w:r>
       <w:r>
         <w:rPr/>
-        <w:t xml:space="preserve">схема функции </w:t>
-      </w:r>
-      <w:r>
-        <w:rPr/>
-        <w:t>is_pcnf</w:t>
+        <w:t>схема функции is_pcnf</w:t>
       </w:r>
     </w:p>
     <w:p>

</xml_diff>